<commit_message>
v18: ASCII filename + IP support in header
</commit_message>
<xml_diff>
--- a/templates/contract.docx
+++ b/templates/contract.docx
@@ -202,25 +202,11 @@
           <w:color w:val="000000"/>
           <w:spacing w:val="-8"/>
         </w:rPr>
-        <w:t xml:space="preserve"> в лице генерального директора </w:t>
+        <w:t xml:space="preserve">{{ client.intro_clause }} </w:t>
       </w:r>
       <w:bookmarkStart w:id="3" w:name="_Hlk210656570"/>
       <w:bookmarkStart w:id="4" w:name="_Hlk205388788"/>
-      <w:r>
-        <w:rPr>
-          <w:color w:val="000000"/>
-          <w:spacing w:val="-8"/>
-        </w:rPr>
-        <w:t>{{ client.director_genitive }}</w:t>
-      </w:r>
       <w:bookmarkEnd w:id="3"/>
-      <w:r>
-        <w:rPr>
-          <w:color w:val="000000"/>
-          <w:spacing w:val="-8"/>
-        </w:rPr>
-        <w:t xml:space="preserve">, действующего на основании Устава, </w:t>
-      </w:r>
       <w:bookmarkEnd w:id="4"/>
       <w:r>
         <w:rPr>
@@ -5087,7 +5073,7 @@
           <w:szCs w:val="22"/>
           <w:lang w:val="ru-RU"/>
         </w:rPr>
-        <w:t xml:space="preserve">именуемое в дальнейшем «Клиент», в лице генерального директора {{ client.director_genitive }}, действующего на основании Устава, с одной стороны, и </w:t>
+        <w:t xml:space="preserve">именуемое в дальнейшем «Клиент»{{ client.intro_clause }}, с одной стороны, и </w:t>
       </w:r>
       <w:r>
         <w:rPr>

</xml_diff>

<commit_message>
template: hide КПП row for ИП (jinja conditional)
</commit_message>
<xml_diff>
--- a/templates/contract.docx
+++ b/templates/contract.docx
@@ -3934,6 +3934,11 @@
             </w:r>
           </w:p>
           <w:p>
+            <w:r>
+              <w:t xml:space="preserve">{%p if client.kpp %}</w:t>
+            </w:r>
+          </w:p>
+          <w:p>
             <w:pPr>
               <w:ind w:right="117"/>
               <w:contextualSpacing/>
@@ -3960,6 +3965,11 @@
                 <w:lang w:val="uk-UA"/>
               </w:rPr>
               <w:t>{{ client.kpp }}</w:t>
+            </w:r>
+          </w:p>
+          <w:p>
+            <w:r>
+              <w:t xml:space="preserve">{%p endif %}</w:t>
             </w:r>
           </w:p>
           <w:p>

</xml_diff>

<commit_message>
Add client email and phone to contract requisites
</commit_message>
<xml_diff>
--- a/templates/contract.docx
+++ b/templates/contract.docx
@@ -4144,6 +4144,82 @@
                 <w:lang w:val="uk-UA"/>
               </w:rPr>
               <w:t>{{ client.cor_account }}</w:t>
+            </w:r>
+          </w:p>
+          <w:p>
+            <w:r>
+              <w:t xml:space="preserve">{%p if client.email %}</w:t>
+            </w:r>
+          </w:p>
+          <w:p>
+            <w:pPr>
+              <w:ind w:right="117"/>
+              <w:contextualSpacing/>
+              <w:jc w:val="both"/>
+              <w:rPr>
+                <w:bCs/>
+                <w:color w:val="000000"/>
+                <w:spacing w:val="-8"/>
+              </w:rPr>
+            </w:pPr>
+            <w:r>
+              <w:rPr>
+                <w:bCs/>
+                <w:color w:val="000000"/>
+                <w:spacing w:val="-8"/>
+              </w:rPr>
+              <w:t xml:space="preserve">Email: </w:t>
+            </w:r>
+            <w:r>
+              <w:rPr>
+                <w:bCs/>
+                <w:color w:val="000000"/>
+                <w:spacing w:val="-8"/>
+              </w:rPr>
+              <w:t>{{ client.email }}</w:t>
+            </w:r>
+          </w:p>
+          <w:p>
+            <w:r>
+              <w:t xml:space="preserve">{%p endif %}</w:t>
+            </w:r>
+          </w:p>
+          <w:p>
+            <w:r>
+              <w:t xml:space="preserve">{%p if client.phone %}</w:t>
+            </w:r>
+          </w:p>
+          <w:p>
+            <w:pPr>
+              <w:ind w:right="117"/>
+              <w:contextualSpacing/>
+              <w:jc w:val="both"/>
+              <w:rPr>
+                <w:bCs/>
+                <w:color w:val="000000"/>
+                <w:spacing w:val="-8"/>
+              </w:rPr>
+            </w:pPr>
+            <w:r>
+              <w:rPr>
+                <w:bCs/>
+                <w:color w:val="000000"/>
+                <w:spacing w:val="-8"/>
+              </w:rPr>
+              <w:t xml:space="preserve">Тел.: </w:t>
+            </w:r>
+            <w:r>
+              <w:rPr>
+                <w:bCs/>
+                <w:color w:val="000000"/>
+                <w:spacing w:val="-8"/>
+              </w:rPr>
+              <w:t>{{ client.phone }}</w:t>
+            </w:r>
+          </w:p>
+          <w:p>
+            <w:r>
+              <w:t xml:space="preserve">{%p endif %}</w:t>
             </w:r>
           </w:p>
           <w:p>

</xml_diff>